<commit_message>
Part B 重大重建: 换订正数据底 + best-of-both按日 + 全shapefile + 清理
数据订正(旧 Tourist/TOTAL 队友确认做错,已删):
- 改用 background_od + total_new_project_flow_internal_only(PROJECT)
- 净增量 = PROJECT-background = 960万(+9.7%); best-of-both 按日(增量÷20赛事日)
- 弃用被本底污染的 event/non_event 日矩阵(保留作证据链)
- 修正分区语义: 火车站=zone79(并入L1走廊), zone1=Centro Direzionale

新结果: L1 0.71→0.91(60%破1.09,走廊级1.20) binding constraint; L2 0.70/L6 0.65/Cumana 0.51

产出(全部重建+一致): 5脚本 + 5图(全shapefile真实地图,无散点) + 方法论 + 答辩话术
+ docx(5图+正文) + pptx(图+文字+演讲备注) + B_zone_metrics.csv + CLAUDE.md

清理: 删旧Part A图chart1-6 + 散点/冗余图 + 做错的旧矩阵

Co-Authored-By: Claude Opus 4.8 <noreply@anthropic.com>
</commit_message>
<xml_diff>
--- a/5.11 fjy/PartB_section.docx
+++ b/5.11 fjy/PartB_section.docx
@@ -50,7 +50,7 @@
     </w:p>
     <w:p>
       <w:r>
-        <w:t>The demand model concentrates arrivals in 9 traffic zones. Seven came from the demand-forecast destinations; we additionally include zones 2 and 33 (Fuorigrotta / Mostra d’Oltremare), the western rail interchange (Cumana + Line 2 + Line 6) feeding the Bagnoli race course, otherwise omitted.</w:t>
+        <w:t>The demand model concentrates arrivals in the central-Naples and venue zones (identities taken from the official zone coordinates). Two corridors are analysed, plus the Napoli Centrale rail hub:</w:t>
       </w:r>
     </w:p>
     <w:p>
@@ -58,7 +58,7 @@
         <w:pStyle w:val="ListBullet"/>
       </w:pPr>
       <w:r>
-        <w:t>West corridor (venue): zones 2, 10, 33 — Bagnoli / Fuorigrotta race &amp; tech zone.</w:t>
+        <w:t>West corridor (venue): zones 10, 2, 33 — Bagnoli race &amp; tech zone and the Fuorigrotta / Mostra western interchange (Cumana + Line 2 + Line 6).</w:t>
       </w:r>
     </w:p>
     <w:p>
@@ -66,7 +66,7 @@
         <w:pStyle w:val="ListBullet"/>
       </w:pPr>
       <w:r>
-        <w:t>Central corridor (gateway + race village): zones 1, 3, 71, 195, 216 — central waterfront and the Napoli Centrale rail gateway.</w:t>
+        <w:t>Central corridor (waterfront + gateway): zones 3, 1, 71, 195, 216 and zone 79 — central waterfront, Centro Direzionale and the Napoli Centrale rail hub (Lines 1+2). The station hub proper is zone 79 (~0.8 km from the platforms); zone 1 is the adjacent Centro Direzionale district.</w:t>
       </w:r>
     </w:p>
     <w:p>
@@ -74,7 +74,7 @@
         <w:pStyle w:val="ListBullet"/>
       </w:pPr>
       <w:r>
-        <w:t>Zone 73 (Nocera Superiore, ~30 km SE): accommodation outlier on regional rail, reported separately.</w:t>
+        <w:t>The airport (zone 191) and the Pompeii / Vesuvius tourist zones (68, 212) sit on separate networks (Alibus / Circumvesuviana–EAV regional rail) and are discussed qualitatively, not modelled in the metro V/C.</w:t>
       </w:r>
     </w:p>
     <w:p>
@@ -230,7 +230,7 @@
     </w:tbl>
     <w:p>
       <w:r>
-        <w:t>Region-wide the event adds +11% of trips; in the central event zones the increment reaches +23%, peaking at +50% in the Napoli Centrale gateway zone. Rail peak-hour, per-direction capacity: Metro L1 ≈ 12,000 · Metro L6 ≈ 7,200 · Metro L2 ≈ 3,600 · Cumana ≈ 1,050.</w:t>
+        <w:t>Inputs: background_od.mtx (as-is, 98.8 M trips/month) + total_new_project_flow (PROJECT event scenario, 108.4 M); the tourist surge = PROJECT − background = 9.6 M trips. Region-wide the event adds +9.7%; concentrated on the 20-day event window this raises event-day arrivals into the 9 zones by +25% on average (Race Village +45%, Centro Direzionale +74%, Bagnoli +30%, Napoli Centrale hub +16%). Rail peak-hour, per-direction capacity: Metro L1 ≈ 12,000 · L6 ≈ 7,200 · L2 ≈ 3,600 · Cumana ≈ 1,050.</w:t>
       </w:r>
     </w:p>
     <w:p>
@@ -243,7 +243,7 @@
     </w:p>
     <w:p>
       <w:r>
-        <w:t>Demand chain (per zone): monthly arrivals (matrix column-sum) ÷ 30.4 days → daily; × 8% peak-hour share → peak-hour arrivals (one direction); × 50% transit share → peak-hour rail demand.</w:t>
+        <w:t>Demand chain (per zone): as-is daily = background monthly column-sum ÷ 30.4 days; event-day = as-is daily + (PROJECT − background) column-sum ÷ 20 event days (the surge spread over the days visitors are present); × 8% peak-hour share → peak-hour arrivals (one direction); × 50% transit share → peak-hour rail demand.</w:t>
       </w:r>
     </w:p>
     <w:p>
@@ -267,7 +267,7 @@
     <w:p>
       <w:pPr/>
       <w:r>
-        <w:t>Spatial overview — venues and rail lines: the schematic below locates the three event anchors (Bagnoli venue, Race Village, Napoli Centrale gateway), the western interchange (Fuorigrotta/Mostra) and the four analysed rail corridors, colour-coded by event V/C (peak hour, 50% transit share).</w:t>
+        <w:t>Spatial overview — venues and rail lines: the map below (real Campania zone boundaries) locates the event anchors (Bagnoli venue, Race Village, Napoli Centrale rail hub), the western interchange (Fuorigrotta/Mostra) and the four analysed rail corridors, colour-coded by event-day V/C (peak hour, 50% transit share).</w:t>
       </w:r>
     </w:p>
     <w:p>
@@ -277,7 +277,7 @@
       <w:r>
         <w:drawing>
           <wp:inline xmlns:a="http://schemas.openxmlformats.org/drawingml/2006/main" xmlns:pic="http://schemas.openxmlformats.org/drawingml/2006/picture">
-            <wp:extent cx="5486400" cy="3310493"/>
+            <wp:extent cx="5486400" cy="3312688"/>
             <wp:docPr id="5" name="Picture 5"/>
             <wp:cNvGraphicFramePr>
               <a:graphicFrameLocks noChangeAspect="1"/>
@@ -298,7 +298,7 @@
                   <pic:spPr>
                     <a:xfrm>
                       <a:off x="0" y="0"/>
-                      <a:ext cx="5486400" cy="3310493"/>
+                      <a:ext cx="5486400" cy="3312688"/>
                     </a:xfrm>
                     <a:prstGeom prst="rect"/>
                   </pic:spPr>
@@ -318,7 +318,7 @@
           <w:i/>
           <w:sz w:val="18"/>
         </w:rPr>
-        <w:t>Fig. 1 — Event venues and the four analysed rail corridors (Metro L1/L6/L2 and Cumana), colour-coded by peak-hour event V/C (50% transit share). Line geometry follows major stations (illustrative, not official track GIS).</w:t>
+        <w:t>Fig. 1 — Event venues and the four analysed rail corridors (Metro L1/L6/L2 and Cumana), colour-coded by peak-hour event-day V/C (50% transit share). Line geometry follows major stations (illustrative, not official track GIS).</w:t>
       </w:r>
     </w:p>
     <w:p>
@@ -556,7 +556,7 @@
       <w:r>
         <w:drawing>
           <wp:inline xmlns:a="http://schemas.openxmlformats.org/drawingml/2006/main" xmlns:pic="http://schemas.openxmlformats.org/drawingml/2006/picture">
-            <wp:extent cx="5486400" cy="3302534"/>
+            <wp:extent cx="5486400" cy="3302264"/>
             <wp:docPr id="1" name="Picture 1"/>
             <wp:cNvGraphicFramePr>
               <a:graphicFrameLocks noChangeAspect="1"/>
@@ -577,7 +577,7 @@
                   <pic:spPr>
                     <a:xfrm>
                       <a:off x="0" y="0"/>
-                      <a:ext cx="5486400" cy="3302534"/>
+                      <a:ext cx="5486400" cy="3302264"/>
                     </a:xfrm>
                     <a:prstGeom prst="rect"/>
                   </pic:spPr>
@@ -602,7 +602,7 @@
     </w:p>
     <w:p>
       <w:r>
-        <w:t>Sensitivity: at 40% transit share L1 sits at 0.67; at 50% it reaches 0.84; at 60% it crosses 1.01 (oversaturated). All other lines stay below 0.75. L1 is the only line at risk.</w:t>
+        <w:t>Sensitivity: at 40% transit share L1 sits at 0.73; at 50% it reaches 0.91; at 60% it crosses 1.09 (oversaturated). The corridor-level caliber (all central demand on L1) gives event-day V/C = 1.20. All other lines stay at or below 0.84. L1 is the only line at risk.</w:t>
       </w:r>
     </w:p>
     <w:p>
@@ -612,7 +612,7 @@
       <w:r>
         <w:drawing>
           <wp:inline xmlns:a="http://schemas.openxmlformats.org/drawingml/2006/main" xmlns:pic="http://schemas.openxmlformats.org/drawingml/2006/picture">
-            <wp:extent cx="5486400" cy="3315820"/>
+            <wp:extent cx="5486400" cy="3315980"/>
             <wp:docPr id="2" name="Picture 2"/>
             <wp:cNvGraphicFramePr>
               <a:graphicFrameLocks noChangeAspect="1"/>
@@ -633,7 +633,7 @@
                   <pic:spPr>
                     <a:xfrm>
                       <a:off x="0" y="0"/>
-                      <a:ext cx="5486400" cy="3315820"/>
+                      <a:ext cx="5486400" cy="3315980"/>
                     </a:xfrm>
                     <a:prstGeom prst="rect"/>
                   </pic:spPr>
@@ -668,7 +668,7 @@
       <w:r>
         <w:drawing>
           <wp:inline xmlns:a="http://schemas.openxmlformats.org/drawingml/2006/main" xmlns:pic="http://schemas.openxmlformats.org/drawingml/2006/picture">
-            <wp:extent cx="5486400" cy="3838222"/>
+            <wp:extent cx="5486400" cy="3838285"/>
             <wp:docPr id="3" name="Picture 3"/>
             <wp:cNvGraphicFramePr>
               <a:graphicFrameLocks noChangeAspect="1"/>
@@ -689,7 +689,7 @@
                   <pic:spPr>
                     <a:xfrm>
                       <a:off x="0" y="0"/>
-                      <a:ext cx="5486400" cy="3838222"/>
+                      <a:ext cx="5486400" cy="3838285"/>
                     </a:xfrm>
                     <a:prstGeom prst="rect"/>
                   </pic:spPr>
@@ -714,7 +714,7 @@
     </w:p>
     <w:p>
       <w:r>
-        <w:t>Road accessibility (OSRM): of the tourist demand originating within Campania, 73% is within a 45-minute drive of the venues (weighted-mean 37 min); but ~20% originates beyond 60 minutes (Salerno/Avellino/Cilento), depending on long road approaches and regional rail.</w:t>
+        <w:t>Road accessibility (OSRM): of the tourist demand originating within Campania, 71% is within a 45-minute drive of the venues (weighted-mean 41 min); but ~21% originates beyond 60 minutes (Salerno/Avellino/Cilento), depending on long road approaches and regional rail.</w:t>
       </w:r>
     </w:p>
     <w:p>
@@ -724,7 +724,7 @@
       <w:r>
         <w:drawing>
           <wp:inline xmlns:a="http://schemas.openxmlformats.org/drawingml/2006/main" xmlns:pic="http://schemas.openxmlformats.org/drawingml/2006/picture">
-            <wp:extent cx="5486400" cy="4797173"/>
+            <wp:extent cx="5486400" cy="4783043"/>
             <wp:docPr id="4" name="Picture 4"/>
             <wp:cNvGraphicFramePr>
               <a:graphicFrameLocks noChangeAspect="1"/>
@@ -745,7 +745,7 @@
                   <pic:spPr>
                     <a:xfrm>
                       <a:off x="0" y="0"/>
-                      <a:ext cx="5486400" cy="4797173"/>
+                      <a:ext cx="5486400" cy="4783043"/>
                     </a:xfrm>
                     <a:prstGeom prst="rect"/>
                   </pic:spPr>
@@ -786,7 +786,7 @@
         <w:pStyle w:val="ListBullet"/>
       </w:pPr>
       <w:r>
-        <w:t>Metro Line 1 is the binding constraint — the central spine serving the race village and the Napoli Centrale gateway. The event pushes it from 0.69 to 0.84 (near-capacity), leaving no reserve, and it tips into oversaturation (&gt;1.0) under a 60% transit share. The steepest demand growth (+50%) lands on this corridor.</w:t>
+        <w:t>Metro Line 1 is the binding constraint — the central spine serving the race village, Centro Direzionale and the Napoli Centrale gateway. The event pushes it from 0.71 to 0.91 on an event day, leaving essentially no reserve, and it tips into oversaturation (&gt;1.0) under a 60% transit share or the corridor-concentration caliber (1.20). The steepest demand growth lands on this corridor.</w:t>
       </w:r>
     </w:p>
     <w:p>
@@ -794,7 +794,7 @@
         <w:pStyle w:val="ListBullet"/>
       </w:pPr>
       <w:r>
-        <w:t>The race venue (Bagnoli/Fuorigrotta) is over-served — three lines carry only V/C ≈ 0.35–0.62.</w:t>
+        <w:t>The race venue (Bagnoli/Fuorigrotta) is over-served — three lines (Cumana, L2, L6) carry only V/C ≈ 0.51–0.70, i.e. ample spare capacity.</w:t>
       </w:r>
     </w:p>
     <w:p>

</xml_diff>